<commit_message>
Add nutrient and co-pollution experiments, evidence sources and Atlas map context
</commit_message>
<xml_diff>
--- a/dist/scientific-definition.docx
+++ b/dist/scientific-definition.docx
@@ -7,6 +7,10 @@
         <w:pStyle w:val="Subtitle"/>
       </w:pPr>
       <w:r>
+        <w:rPr>
+          <w:color w:val="000000"/>
+          <w:u w:val="none"/>
+        </w:rPr>
         <w:t>RESEARCH DEFINITION / 2026</w:t>
       </w:r>
     </w:p>
@@ -15,6 +19,10 @@
         <w:pStyle w:val="Title"/>
       </w:pPr>
       <w:r>
+        <w:rPr>
+          <w:color w:val="000000"/>
+          <w:u w:val="none"/>
+        </w:rPr>
         <w:t>CoralBleach-Agent</w:t>
       </w:r>
     </w:p>
@@ -25,8 +33,9 @@
       <w:r>
         <w:rPr>
           <w:b/>
-          <w:color w:val="173D46"/>
+          <w:color w:val="000000"/>
           <w:sz w:val="44"/>
+          <w:u w:val="none"/>
         </w:rPr>
         <w:t>面向复杂环境扰动的</w:t>
         <w:br/>
@@ -43,6 +52,8 @@
       <w:r>
         <w:rPr>
           <w:b w:val="0"/>
+          <w:color w:val="000000"/>
+          <w:u w:val="none"/>
         </w:rPr>
         <w:t>科学问题定义与最小验证方案</w:t>
       </w:r>
@@ -72,6 +83,9 @@
       </w:r>
     </w:p>
     <w:p>
+      <w:pPr>
+        <w:keepNext/>
+      </w:pPr>
       <w:r>
         <w:drawing>
           <wp:inline xmlns:a="http://schemas.openxmlformats.org/drawingml/2006/main" xmlns:pic="http://schemas.openxmlformats.org/drawingml/2006/picture">
@@ -113,10 +127,7 @@
         <w:jc w:val="left"/>
       </w:pPr>
       <w:r>
-        <w:rPr>
-          <w:b w:val="0"/>
-        </w:rPr>
-        <w:t>2026 年 10 月 18 日  ·  版本 1.0</w:t>
+        <w:t>2026 年 10 月 18 日  ·  版本 1.1 Demo 同步修订版</w:t>
       </w:r>
     </w:p>
     <w:p>
@@ -128,7 +139,7 @@
         <w:rPr>
           <w:b w:val="0"/>
         </w:rPr>
-        <w:t>演示工程使用合成数据；真实环境预测、机制解释和效率优势分别验证。</w:t>
+        <w:t>结合珊瑚研究依据与前期海洋环境论文。演示结果使用合成数据。</w:t>
       </w:r>
     </w:p>
     <w:p>
@@ -144,6 +155,8 @@
       <w:r>
         <w:rPr>
           <w:b w:val="0"/>
+          <w:color w:val="000000"/>
+          <w:u w:val="none"/>
         </w:rPr>
         <w:t>项目摘要</w:t>
       </w:r>
@@ -156,7 +169,7 @@
         <w:rPr>
           <w:b w:val="0"/>
         </w:rPr>
-        <w:t>相近的热暴露可以对应不同的珊瑚白化响应。预警因此需要回答：在热压力已经可知时，哪些局地条件能进一步区分需要优先调查的礁区，环境信号应提前多久进入判断，以及这些关系能否在未参与建模的区域保持。CoralBleach-Agent 将这一问题组织为有限预算下的假设检验：以现场白化记录定义目标，以热应激、光照和生态背景描述暴露与敏感性，再检验水动力相关的先行信号是否提供额外信息。</w:t>
+        <w:t>相近的热暴露可以对应不同的珊瑚白化响应。已有珊瑚野外研究揭示了局地人为压力与长期珊瑚覆盖变化的区域差异，实验研究进一步表明，硝酸盐与铵盐在热胁迫下可能产生不同的白化响应，扑草净也可能改变珊瑚对硝酸盐的敏感性。[8–10] 本项目据此聚焦一个可检验的问题：在热暴露已知时，营养盐形态、陆源共污染及生态背景，能否帮助识别未来第 7、14、30 天更可能出现白化的礁区；必要的先行环境信息应从何处、提前多久获取？</w:t>
       </w:r>
     </w:p>
     <w:p>
@@ -164,10 +177,7 @@
         <w:jc w:val="both"/>
       </w:pPr>
       <w:r>
-        <w:rPr>
-          <w:b w:val="0"/>
-        </w:rPr>
-        <w:t>项目的设计优势集中在三个环节。第一，环境风险、白化证据与生态后果分别存储和展示，防止环境代理替代生物终点。第二，将预测提前期与环境滞后分别定义，通过时空留出及方向、错时对照检验新增信息。第三，大模型依据研究问题和数据摘要进行场景诊断，从科学模型池提出受限动作；数值工具执行实验并返回验证反馈，规划器据此修正下一步，在预算内完成反例检查和方案冻结，使“下一项实验为何值得做”可以复核。当前交付实现上述计算流程和交互演示；真实预测性能、搜索效率优势与海洋过程解释分别进入后续验证。</w:t>
+        <w:t>项目提出者的 GCB、两篇 EST 及以第二作者参与的 NC 研究，分别为资源背景依赖、复合胁迫下的时空错位、表观状态与生态后果的区分，以及遗漏环境因子造成的判断偏差提供了前期研究基础。[11–14] CoralBleach-Agent 将这些研究思路用于珊瑚任务：大模型读取场景与证据，从模型池规划下一项可检验的比较；数值工具执行实验，返回验证反馈，并在预算内完成对照与方案冻结。项目以独立礁区的预测质量和固定调查容量下的事件覆盖评价新增信息。当前 Demo 已实现合成数据上的计算闭环，并新增氮形态与共污染的合成实验路线；真实浓度与白化观测接入仍待完成。</w:t>
       </w:r>
     </w:p>
     <w:p>
@@ -178,6 +188,8 @@
       <w:r>
         <w:rPr>
           <w:b w:val="0"/>
+          <w:color w:val="000000"/>
+          <w:u w:val="none"/>
         </w:rPr>
         <w:t>一、科学问题：热暴露相近时，风险判断还缺少什么</w:t>
       </w:r>
@@ -190,6 +202,8 @@
       <w:r>
         <w:rPr>
           <w:b w:val="0"/>
+          <w:color w:val="000000"/>
+          <w:u w:val="none"/>
         </w:rPr>
         <w:t>1.1 从暴露到响应的辨识问题</w:t>
       </w:r>
@@ -224,6 +238,8 @@
       <w:r>
         <w:rPr>
           <w:b w:val="0"/>
+          <w:color w:val="000000"/>
+          <w:u w:val="none"/>
         </w:rPr>
         <w:t>1.2 中心问题与研究切片</w:t>
       </w:r>
@@ -236,7 +252,7 @@
         <w:rPr>
           <w:b w:val="0"/>
         </w:rPr>
-        <w:t>核心科学问题是：在局地热应激已知、调查协议可比且输入时间受到约束的条件下，复合环境条件、生态敏感性与水动力相关的先行信号，能否改善未来第 7、14、30 天珊瑚白化状态的预测，并提高固定调查容量下的事件覆盖？如果能够改善，增益来自哪个条件、哪个时间尺度，又在哪些区域不能复现？</w:t>
+        <w:t>核心科学问题是：在相近热暴露下，氮形态及陆源共污染是否改变珊瑚的白化易感性；将这些局地条件、生态敏感性和水动力相关的先行环境信息纳入预测后，能否改善未来第 7、14、30 天的白化判断，并提高固定调查容量下的事件覆盖？研究同时追问增益出现在哪些环境背景、提前期和区域，以及哪些条件下局地热暴露已足以支持判断。</w:t>
       </w:r>
     </w:p>
     <w:p>
@@ -253,13 +269,652 @@
     <w:p>
       <w:pPr>
         <w:pStyle w:val="Heading2"/>
+      </w:pPr>
+      <w:r>
+        <w:rPr>
+          <w:b w:val="0"/>
+          <w:color w:val="000000"/>
+          <w:u w:val="none"/>
+        </w:rPr>
+        <w:t>1.3 珊瑚研究依据与前期方法积累</w:t>
+      </w:r>
+    </w:p>
+    <w:p>
+      <w:pPr>
+        <w:widowControl/>
+        <w:jc w:val="both"/>
+      </w:pPr>
+      <w:commentRangeStart w:id="0"/>
+      <w:r>
+        <w:rPr>
+          <w:b w:val="0"/>
+        </w:rPr>
+        <w:t>珊瑚野外与实验研究把“局地条件”具体落实到营养盐、污染物与热胁迫的关系。Xu 等基于北部南海长期资料，发现局地人为压力与活珊瑚覆盖变化的关系具有区域差异。[8] 这支持在统一热暴露指标之外识别区域背景，也为选择先导区域提供依据。该研究的终点是长期活珊瑚覆盖变化；本项目需要另行取得有明确日期的白化调查，才能研究短期白化预警。</w:t>
+      </w:r>
+      <w:commentRangeEnd w:id="0"/>
+      <w:r>
+        <w:rPr>
+          <w:rStyle w:val="CommentReference"/>
+        </w:rPr>
+        <w:commentReference w:id="0"/>
+      </w:r>
+    </w:p>
+    <w:p>
+      <w:pPr>
+        <w:widowControl/>
+        <w:jc w:val="both"/>
+      </w:pPr>
+      <w:r>
+        <w:rPr>
+          <w:b w:val="0"/>
+        </w:rPr>
+        <w:t>Zhang、Kang 等的珊瑚实验发现，在所测试条件下，硝酸盐加重而铵盐减轻了热白化，并涉及不同的脂质相关过程和应激响应。[9] 因而，总无机氮相近的样本仍可能具有不同的白化敏感性。Li 等的实验则表明，扑草净可增加造礁珊瑚对硝酸盐胁迫的易感性。[10] 两项研究分别支持区分氮形态、检验污染物与营养盐交互；后者没有直接验证热胁迫、氮形态与扑草净的三重交互。实验中的效应方向需在物种、浓度与暴露条件相容的现场资料中重新检验，不能据此提出向海域补加铵盐的措施。</w:t>
+      </w:r>
+    </w:p>
+    <w:p>
+      <w:pPr>
+        <w:widowControl/>
+        <w:jc w:val="both"/>
+      </w:pPr>
+      <w:commentRangeStart w:id="1"/>
+      <w:r>
+        <w:rPr>
+          <w:b w:val="0"/>
+        </w:rPr>
+        <w:t>项目提出者的四篇海洋环境论文提供了跨系统分析经验。它们的共同用途是帮助提出候选关系、选择反例和设计比较；其中的生物终点、效应量与已训练模型均不直接转用于珊瑚。对应关系如下。</w:t>
+      </w:r>
+      <w:commentRangeEnd w:id="1"/>
+      <w:r>
+        <w:rPr>
+          <w:rStyle w:val="CommentReference"/>
+        </w:rPr>
+        <w:commentReference w:id="1"/>
+      </w:r>
+    </w:p>
+    <w:tbl>
+      <w:tblPr>
+        <w:tblStyle w:val="TableGrid"/>
+        <w:tblW w:type="auto" w:w="0"/>
+        <w:tblLayout w:type="fixed"/>
+        <w:tblLook w:firstColumn="1" w:firstRow="1" w:lastColumn="0" w:lastRow="0" w:noHBand="0" w:noVBand="1" w:val="04A0"/>
+        <w:tblBorders>
+          <w:top w:val="single" w:sz="4" w:color="D9D9D9"/>
+          <w:left w:val="single" w:sz="4" w:color="D9D9D9"/>
+          <w:bottom w:val="single" w:sz="4" w:color="D9D9D9"/>
+          <w:right w:val="single" w:sz="4" w:color="D9D9D9"/>
+          <w:insideH w:val="single" w:sz="4" w:color="D9D9D9"/>
+          <w:insideV w:val="single" w:sz="4" w:color="D9D9D9"/>
+        </w:tblBorders>
+      </w:tblPr>
+      <w:tblGrid>
+        <w:gridCol w:w="1417"/>
+        <w:gridCol w:w="2721"/>
+        <w:gridCol w:w="2891"/>
+        <w:gridCol w:w="2381"/>
+      </w:tblGrid>
+      <w:tr>
+        <w:trPr>
+          <w:cantSplit/>
+          <w:tblHeader/>
+        </w:trPr>
+        <w:tc>
+          <w:tcPr>
+            <w:tcW w:type="dxa" w:w="1417"/>
+            <w:vAlign w:val="center"/>
+            <w:tcMar>
+              <w:top w:w="85" w:type="dxa"/>
+              <w:left w:w="85" w:type="dxa"/>
+              <w:bottom w:w="85" w:type="dxa"/>
+              <w:right w:w="85" w:type="dxa"/>
+            </w:tcMar>
+            <w:shd w:fill="E7EEF2"/>
+          </w:tcPr>
+          <w:p>
+            <w:pPr>
+              <w:spacing w:line="278" w:lineRule="auto" w:before="100" w:after="100"/>
+              <w:jc w:val="left"/>
+            </w:pPr>
+            <w:r>
+              <w:rPr>
+                <w:b/>
+                <w:color w:val="000000"/>
+                <w:sz w:val="18"/>
+              </w:rPr>
+              <w:t>前期工作</w:t>
+            </w:r>
+          </w:p>
+        </w:tc>
+        <w:tc>
+          <w:tcPr>
+            <w:tcW w:type="dxa" w:w="2721"/>
+            <w:vAlign w:val="center"/>
+            <w:tcMar>
+              <w:top w:w="85" w:type="dxa"/>
+              <w:left w:w="85" w:type="dxa"/>
+              <w:bottom w:w="85" w:type="dxa"/>
+              <w:right w:w="85" w:type="dxa"/>
+            </w:tcMar>
+            <w:shd w:fill="E7EEF2"/>
+          </w:tcPr>
+          <w:p>
+            <w:pPr>
+              <w:spacing w:line="278" w:lineRule="auto" w:before="100" w:after="100"/>
+              <w:jc w:val="left"/>
+            </w:pPr>
+            <w:r>
+              <w:rPr>
+                <w:b/>
+                <w:color w:val="000000"/>
+                <w:sz w:val="18"/>
+              </w:rPr>
+              <w:t>已有研究所支持的思路</w:t>
+            </w:r>
+          </w:p>
+        </w:tc>
+        <w:tc>
+          <w:tcPr>
+            <w:tcW w:type="dxa" w:w="2891"/>
+            <w:vAlign w:val="center"/>
+            <w:tcMar>
+              <w:top w:w="85" w:type="dxa"/>
+              <w:left w:w="85" w:type="dxa"/>
+              <w:bottom w:w="85" w:type="dxa"/>
+              <w:right w:w="85" w:type="dxa"/>
+            </w:tcMar>
+            <w:shd w:fill="E7EEF2"/>
+          </w:tcPr>
+          <w:p>
+            <w:pPr>
+              <w:spacing w:line="278" w:lineRule="auto" w:before="100" w:after="100"/>
+              <w:jc w:val="left"/>
+            </w:pPr>
+            <w:r>
+              <w:rPr>
+                <w:b/>
+                <w:color w:val="000000"/>
+                <w:sz w:val="18"/>
+              </w:rPr>
+              <w:t>珊瑚任务中的具体检验</w:t>
+            </w:r>
+          </w:p>
+        </w:tc>
+        <w:tc>
+          <w:tcPr>
+            <w:tcW w:type="dxa" w:w="2381"/>
+            <w:vAlign w:val="center"/>
+            <w:tcMar>
+              <w:top w:w="85" w:type="dxa"/>
+              <w:left w:w="85" w:type="dxa"/>
+              <w:bottom w:w="85" w:type="dxa"/>
+              <w:right w:w="85" w:type="dxa"/>
+            </w:tcMar>
+            <w:shd w:fill="E7EEF2"/>
+          </w:tcPr>
+          <w:p>
+            <w:pPr>
+              <w:spacing w:line="278" w:lineRule="auto" w:before="100" w:after="100"/>
+              <w:jc w:val="left"/>
+            </w:pPr>
+            <w:r>
+              <w:rPr>
+                <w:b/>
+                <w:color w:val="000000"/>
+                <w:sz w:val="18"/>
+              </w:rPr>
+              <w:t>迁移边界</w:t>
+            </w:r>
+          </w:p>
+        </w:tc>
+      </w:tr>
+      <w:tr>
+        <w:trPr>
+          <w:cantSplit/>
+        </w:trPr>
+        <w:tc>
+          <w:tcPr>
+            <w:tcW w:type="dxa" w:w="1417"/>
+            <w:vAlign w:val="center"/>
+            <w:tcMar>
+              <w:top w:w="85" w:type="dxa"/>
+              <w:left w:w="85" w:type="dxa"/>
+              <w:bottom w:w="85" w:type="dxa"/>
+              <w:right w:w="85" w:type="dxa"/>
+            </w:tcMar>
+          </w:tcPr>
+          <w:p>
+            <w:pPr>
+              <w:spacing w:line="278" w:lineRule="auto" w:before="100" w:after="100"/>
+              <w:jc w:val="left"/>
+            </w:pPr>
+            <w:r>
+              <w:rPr>
+                <w:b w:val="0"/>
+                <w:color w:val="000000"/>
+                <w:sz w:val="18"/>
+              </w:rPr>
+              <w:t>GCB 极地浮游植物研究 [11]</w:t>
+            </w:r>
+          </w:p>
+        </w:tc>
+        <w:tc>
+          <w:tcPr>
+            <w:tcW w:type="dxa" w:w="2721"/>
+            <w:vAlign w:val="center"/>
+            <w:tcMar>
+              <w:top w:w="85" w:type="dxa"/>
+              <w:left w:w="85" w:type="dxa"/>
+              <w:bottom w:w="85" w:type="dxa"/>
+              <w:right w:w="85" w:type="dxa"/>
+            </w:tcMar>
+          </w:tcPr>
+          <w:p>
+            <w:pPr>
+              <w:spacing w:line="278" w:lineRule="auto" w:before="100" w:after="100"/>
+              <w:jc w:val="left"/>
+            </w:pPr>
+            <w:r>
+              <w:rPr>
+                <w:b w:val="0"/>
+                <w:color w:val="000000"/>
+                <w:sz w:val="18"/>
+              </w:rPr>
+              <w:t>热事件的生态响应受资源背景共同影响</w:t>
+            </w:r>
+          </w:p>
+        </w:tc>
+        <w:tc>
+          <w:tcPr>
+            <w:tcW w:type="dxa" w:w="2891"/>
+            <w:vAlign w:val="center"/>
+            <w:tcMar>
+              <w:top w:w="85" w:type="dxa"/>
+              <w:left w:w="85" w:type="dxa"/>
+              <w:bottom w:w="85" w:type="dxa"/>
+              <w:right w:w="85" w:type="dxa"/>
+            </w:tcMar>
+          </w:tcPr>
+          <w:p>
+            <w:pPr>
+              <w:spacing w:line="278" w:lineRule="auto" w:before="100" w:after="100"/>
+              <w:jc w:val="left"/>
+            </w:pPr>
+            <w:r>
+              <w:rPr>
+                <w:b w:val="0"/>
+                <w:color w:val="000000"/>
+                <w:sz w:val="18"/>
+              </w:rPr>
+              <w:t>在相近热暴露下，分层检验营养盐背景与氮形态</w:t>
+            </w:r>
+          </w:p>
+        </w:tc>
+        <w:tc>
+          <w:tcPr>
+            <w:tcW w:type="dxa" w:w="2381"/>
+            <w:vAlign w:val="center"/>
+            <w:tcMar>
+              <w:top w:w="85" w:type="dxa"/>
+              <w:left w:w="85" w:type="dxa"/>
+              <w:bottom w:w="85" w:type="dxa"/>
+              <w:right w:w="85" w:type="dxa"/>
+            </w:tcMar>
+          </w:tcPr>
+          <w:p>
+            <w:pPr>
+              <w:spacing w:line="278" w:lineRule="auto" w:before="100" w:after="100"/>
+              <w:jc w:val="left"/>
+            </w:pPr>
+            <w:r>
+              <w:rPr>
+                <w:b w:val="0"/>
+                <w:color w:val="000000"/>
+                <w:sz w:val="18"/>
+              </w:rPr>
+              <w:t>极地铁供应与浮游植物响应不能直接解释珊瑚白化</w:t>
+            </w:r>
+          </w:p>
+        </w:tc>
+      </w:tr>
+      <w:tr>
+        <w:trPr>
+          <w:cantSplit/>
+        </w:trPr>
+        <w:tc>
+          <w:tcPr>
+            <w:tcW w:type="dxa" w:w="1417"/>
+            <w:vAlign w:val="center"/>
+            <w:tcMar>
+              <w:top w:w="85" w:type="dxa"/>
+              <w:left w:w="85" w:type="dxa"/>
+              <w:bottom w:w="85" w:type="dxa"/>
+              <w:right w:w="85" w:type="dxa"/>
+            </w:tcMar>
+          </w:tcPr>
+          <w:p>
+            <w:pPr>
+              <w:spacing w:line="278" w:lineRule="auto" w:before="100" w:after="100"/>
+              <w:jc w:val="left"/>
+            </w:pPr>
+            <w:r>
+              <w:rPr>
+                <w:b w:val="0"/>
+                <w:color w:val="000000"/>
+                <w:sz w:val="18"/>
+              </w:rPr>
+              <w:t>EST 净初级生产力研究 [12]</w:t>
+            </w:r>
+          </w:p>
+        </w:tc>
+        <w:tc>
+          <w:tcPr>
+            <w:tcW w:type="dxa" w:w="2721"/>
+            <w:vAlign w:val="center"/>
+            <w:tcMar>
+              <w:top w:w="85" w:type="dxa"/>
+              <w:left w:w="85" w:type="dxa"/>
+              <w:bottom w:w="85" w:type="dxa"/>
+              <w:right w:w="85" w:type="dxa"/>
+            </w:tcMar>
+          </w:tcPr>
+          <w:p>
+            <w:pPr>
+              <w:spacing w:line="278" w:lineRule="auto" w:before="100" w:after="100"/>
+              <w:jc w:val="left"/>
+            </w:pPr>
+            <w:r>
+              <w:rPr>
+                <w:b w:val="0"/>
+                <w:color w:val="000000"/>
+                <w:sz w:val="18"/>
+              </w:rPr>
+              <w:t>复合暴露与生态响应可能在空间上错位，且受区域背景影响</w:t>
+            </w:r>
+          </w:p>
+        </w:tc>
+        <w:tc>
+          <w:tcPr>
+            <w:tcW w:type="dxa" w:w="2891"/>
+            <w:vAlign w:val="center"/>
+            <w:tcMar>
+              <w:top w:w="85" w:type="dxa"/>
+              <w:left w:w="85" w:type="dxa"/>
+              <w:bottom w:w="85" w:type="dxa"/>
+              <w:right w:w="85" w:type="dxa"/>
+            </w:tcMar>
+          </w:tcPr>
+          <w:p>
+            <w:pPr>
+              <w:spacing w:line="278" w:lineRule="auto" w:before="100" w:after="100"/>
+              <w:jc w:val="left"/>
+            </w:pPr>
+            <w:r>
+              <w:rPr>
+                <w:b w:val="0"/>
+                <w:color w:val="000000"/>
+                <w:sz w:val="18"/>
+              </w:rPr>
+              <w:t>比较局地、邻域与有物理依据的方向性先行信号</w:t>
+            </w:r>
+          </w:p>
+        </w:tc>
+        <w:tc>
+          <w:tcPr>
+            <w:tcW w:type="dxa" w:w="2381"/>
+            <w:vAlign w:val="center"/>
+            <w:tcMar>
+              <w:top w:w="85" w:type="dxa"/>
+              <w:left w:w="85" w:type="dxa"/>
+              <w:bottom w:w="85" w:type="dxa"/>
+              <w:right w:w="85" w:type="dxa"/>
+            </w:tcMar>
+          </w:tcPr>
+          <w:p>
+            <w:pPr>
+              <w:spacing w:line="278" w:lineRule="auto" w:before="100" w:after="100"/>
+              <w:jc w:val="left"/>
+            </w:pPr>
+            <w:r>
+              <w:rPr>
+                <w:b w:val="0"/>
+                <w:color w:val="000000"/>
+                <w:sz w:val="18"/>
+              </w:rPr>
+              <w:t>统计空间关联不等于输运路径或白化传播</w:t>
+            </w:r>
+          </w:p>
+        </w:tc>
+      </w:tr>
+      <w:tr>
+        <w:trPr>
+          <w:cantSplit/>
+        </w:trPr>
+        <w:tc>
+          <w:tcPr>
+            <w:tcW w:type="dxa" w:w="1417"/>
+            <w:vAlign w:val="center"/>
+            <w:tcMar>
+              <w:top w:w="85" w:type="dxa"/>
+              <w:left w:w="85" w:type="dxa"/>
+              <w:bottom w:w="85" w:type="dxa"/>
+              <w:right w:w="85" w:type="dxa"/>
+            </w:tcMar>
+          </w:tcPr>
+          <w:p>
+            <w:pPr>
+              <w:spacing w:line="278" w:lineRule="auto" w:before="100" w:after="100"/>
+              <w:jc w:val="left"/>
+            </w:pPr>
+            <w:r>
+              <w:rPr>
+                <w:b w:val="0"/>
+                <w:color w:val="000000"/>
+                <w:sz w:val="18"/>
+              </w:rPr>
+              <w:t>EST 海龟研究 [13]</w:t>
+            </w:r>
+          </w:p>
+        </w:tc>
+        <w:tc>
+          <w:tcPr>
+            <w:tcW w:type="dxa" w:w="2721"/>
+            <w:vAlign w:val="center"/>
+            <w:tcMar>
+              <w:top w:w="85" w:type="dxa"/>
+              <w:left w:w="85" w:type="dxa"/>
+              <w:bottom w:w="85" w:type="dxa"/>
+              <w:right w:w="85" w:type="dxa"/>
+            </w:tcMar>
+          </w:tcPr>
+          <w:p>
+            <w:pPr>
+              <w:spacing w:line="278" w:lineRule="auto" w:before="100" w:after="100"/>
+              <w:jc w:val="left"/>
+            </w:pPr>
+            <w:r>
+              <w:rPr>
+                <w:b w:val="0"/>
+                <w:color w:val="000000"/>
+                <w:sz w:val="18"/>
+              </w:rPr>
+              <w:t>表观驻留状态与复合暴露后果可能不一致</w:t>
+            </w:r>
+          </w:p>
+        </w:tc>
+        <w:tc>
+          <w:tcPr>
+            <w:tcW w:type="dxa" w:w="2891"/>
+            <w:vAlign w:val="center"/>
+            <w:tcMar>
+              <w:top w:w="85" w:type="dxa"/>
+              <w:left w:w="85" w:type="dxa"/>
+              <w:bottom w:w="85" w:type="dxa"/>
+              <w:right w:w="85" w:type="dxa"/>
+            </w:tcMar>
+          </w:tcPr>
+          <w:p>
+            <w:pPr>
+              <w:spacing w:line="278" w:lineRule="auto" w:before="100" w:after="100"/>
+              <w:jc w:val="left"/>
+            </w:pPr>
+            <w:r>
+              <w:rPr>
+                <w:b w:val="0"/>
+                <w:color w:val="000000"/>
+                <w:sz w:val="18"/>
+              </w:rPr>
+              <w:t>分别记录热暴露、白化观测及死亡或恢复随访</w:t>
+            </w:r>
+          </w:p>
+        </w:tc>
+        <w:tc>
+          <w:tcPr>
+            <w:tcW w:type="dxa" w:w="2381"/>
+            <w:vAlign w:val="center"/>
+            <w:tcMar>
+              <w:top w:w="85" w:type="dxa"/>
+              <w:left w:w="85" w:type="dxa"/>
+              <w:bottom w:w="85" w:type="dxa"/>
+              <w:right w:w="85" w:type="dxa"/>
+            </w:tcMar>
+          </w:tcPr>
+          <w:p>
+            <w:pPr>
+              <w:spacing w:line="278" w:lineRule="auto" w:before="100" w:after="100"/>
+              <w:jc w:val="left"/>
+            </w:pPr>
+            <w:r>
+              <w:rPr>
+                <w:b w:val="0"/>
+                <w:color w:val="000000"/>
+                <w:sz w:val="18"/>
+              </w:rPr>
+              <w:t>海龟行为与生态陷阱不能直接迁移为珊瑚机制</w:t>
+            </w:r>
+          </w:p>
+        </w:tc>
+      </w:tr>
+      <w:tr>
+        <w:trPr>
+          <w:cantSplit/>
+        </w:trPr>
+        <w:tc>
+          <w:tcPr>
+            <w:tcW w:type="dxa" w:w="1417"/>
+            <w:vAlign w:val="center"/>
+            <w:tcMar>
+              <w:top w:w="85" w:type="dxa"/>
+              <w:left w:w="85" w:type="dxa"/>
+              <w:bottom w:w="85" w:type="dxa"/>
+              <w:right w:w="85" w:type="dxa"/>
+            </w:tcMar>
+          </w:tcPr>
+          <w:p>
+            <w:pPr>
+              <w:spacing w:line="278" w:lineRule="auto" w:before="100" w:after="100"/>
+              <w:jc w:val="left"/>
+            </w:pPr>
+            <w:r>
+              <w:rPr>
+                <w:b w:val="0"/>
+                <w:color w:val="000000"/>
+                <w:sz w:val="18"/>
+              </w:rPr>
+              <w:t>NC 极端降水研究 第二作者 [14]</w:t>
+            </w:r>
+          </w:p>
+        </w:tc>
+        <w:tc>
+          <w:tcPr>
+            <w:tcW w:type="dxa" w:w="2721"/>
+            <w:vAlign w:val="center"/>
+            <w:tcMar>
+              <w:top w:w="85" w:type="dxa"/>
+              <w:left w:w="85" w:type="dxa"/>
+              <w:bottom w:w="85" w:type="dxa"/>
+              <w:right w:w="85" w:type="dxa"/>
+            </w:tcMar>
+          </w:tcPr>
+          <w:p>
+            <w:pPr>
+              <w:spacing w:line="278" w:lineRule="auto" w:before="100" w:after="100"/>
+              <w:jc w:val="left"/>
+            </w:pPr>
+            <w:r>
+              <w:rPr>
+                <w:b w:val="0"/>
+                <w:color w:val="000000"/>
+                <w:sz w:val="18"/>
+              </w:rPr>
+              <w:t>忽略环境因子可能改变对生态功能的估计</w:t>
+            </w:r>
+          </w:p>
+        </w:tc>
+        <w:tc>
+          <w:tcPr>
+            <w:tcW w:type="dxa" w:w="2891"/>
+            <w:vAlign w:val="center"/>
+            <w:tcMar>
+              <w:top w:w="85" w:type="dxa"/>
+              <w:left w:w="85" w:type="dxa"/>
+              <w:bottom w:w="85" w:type="dxa"/>
+              <w:right w:w="85" w:type="dxa"/>
+            </w:tcMar>
+          </w:tcPr>
+          <w:p>
+            <w:pPr>
+              <w:spacing w:line="278" w:lineRule="auto" w:before="100" w:after="100"/>
+              <w:jc w:val="left"/>
+            </w:pPr>
+            <w:r>
+              <w:rPr>
+                <w:b w:val="0"/>
+                <w:color w:val="000000"/>
+                <w:sz w:val="18"/>
+              </w:rPr>
+              <w:t>比较纳入与移除局地因子后，白化排序和调查命中是否改变</w:t>
+            </w:r>
+          </w:p>
+        </w:tc>
+        <w:tc>
+          <w:tcPr>
+            <w:tcW w:type="dxa" w:w="2381"/>
+            <w:vAlign w:val="center"/>
+            <w:tcMar>
+              <w:top w:w="85" w:type="dxa"/>
+              <w:left w:w="85" w:type="dxa"/>
+              <w:bottom w:w="85" w:type="dxa"/>
+              <w:right w:w="85" w:type="dxa"/>
+            </w:tcMar>
+          </w:tcPr>
+          <w:p>
+            <w:pPr>
+              <w:spacing w:line="278" w:lineRule="auto" w:before="100" w:after="100"/>
+              <w:jc w:val="left"/>
+            </w:pPr>
+            <w:r>
+              <w:rPr>
+                <w:b w:val="0"/>
+                <w:color w:val="000000"/>
+                <w:sz w:val="18"/>
+              </w:rPr>
+              <w:t>海气 CO₂ 通量结果不作为珊瑚白化或钙化证据</w:t>
+            </w:r>
+          </w:p>
+        </w:tc>
+      </w:tr>
+    </w:tbl>
+    <w:p>
+      <w:pPr>
+        <w:pStyle w:val="Heading2"/>
         <w:jc w:val="left"/>
       </w:pPr>
       <w:r>
         <w:rPr>
           <w:b w:val="0"/>
+          <w:color w:val="000000"/>
+          <w:u w:val="none"/>
         </w:rPr>
-        <w:t>1.3 方法价值落在何处</w:t>
+        <w:t>1.4 本项目拟增加的认识</w:t>
       </w:r>
     </w:p>
     <w:p>
@@ -270,7 +925,7 @@
         <w:rPr>
           <w:b w:val="0"/>
         </w:rPr>
-        <w:t>证据分层解决“模型究竟预测了什么”的问题；时滞与空间对照解决“新增信息是否超出局地热暴露”的问题；有预算的探索与封存评估解决“如何选择下一项实验而不把测试集变成调参工具”的问题。三者共同形成可审核的研究环境。其价值由标签审计、适当对照和可复现运行支撑，不以模型数量或复杂度命名。</w:t>
+        <w:t>已有实验已经提示氮形态与污染物可能调节珊瑚响应，本项目拟进一步检验这些条件能否在独立礁区和未来日期改善预警判断。新增认识应体现为可复现的条件差异，例如在什么营养盐背景下，仅依赖热暴露会遗漏高风险礁区，以及这种遗漏是否改变调查优先级。空间先行信息只有在超出局地解释、通过方向和错时对照后，才进入后续物理核查。Agent 的方法价值则由相同预算下的选择效率、失败记录和可复核的实验轨迹评价。</w:t>
       </w:r>
     </w:p>
     <w:p>
@@ -281,6 +936,8 @@
       <w:r>
         <w:rPr>
           <w:b w:val="0"/>
+          <w:color w:val="000000"/>
+          <w:u w:val="none"/>
         </w:rPr>
         <w:t>二、目标变量、预测单位与三层证据</w:t>
       </w:r>
@@ -293,6 +950,8 @@
       <w:r>
         <w:rPr>
           <w:b w:val="0"/>
+          <w:color w:val="000000"/>
+          <w:u w:val="none"/>
         </w:rPr>
         <w:t>2.1 可计算的目标定义</w:t>
       </w:r>
@@ -338,6 +997,8 @@
       <w:r>
         <w:rPr>
           <w:b w:val="0"/>
+          <w:color w:val="000000"/>
+          <w:u w:val="none"/>
         </w:rPr>
         <w:t>2.2 三层信息的接口边界</w:t>
       </w:r>
@@ -677,6 +1338,8 @@
       <w:r>
         <w:rPr>
           <w:b w:val="0"/>
+          <w:color w:val="000000"/>
+          <w:u w:val="none"/>
         </w:rPr>
         <w:t>2.3 真实数据接入优先级</w:t>
       </w:r>
@@ -705,12 +1368,538 @@
     </w:p>
     <w:p>
       <w:pPr>
+        <w:pStyle w:val="Heading2"/>
+      </w:pPr>
+      <w:r>
+        <w:rPr>
+          <w:b w:val="0"/>
+          <w:color w:val="000000"/>
+          <w:u w:val="none"/>
+        </w:rPr>
+        <w:t>2.4 氮形态与共污染模块的接入条件</w:t>
+      </w:r>
+    </w:p>
+    <w:p>
+      <w:pPr>
+        <w:widowControl/>
+        <w:jc w:val="both"/>
+      </w:pPr>
+      <w:r>
+        <w:rPr>
+          <w:b w:val="0"/>
+        </w:rPr>
+        <w:t>扩展数据按可获得性分层接入。具备全球或大范围覆盖的热暴露作为共同基线；营养盐形态与污染物仅在测量或经过验证的产品足以支持目标尺度时使用。一次采样不能自动代表整个白化季，流域施肥或土地利用强度也不能直接当作礁区水体中的化学浓度。</w:t>
+      </w:r>
+    </w:p>
+    <w:tbl>
+      <w:tblPr>
+        <w:tblStyle w:val="TableGrid"/>
+        <w:tblW w:type="auto" w:w="0"/>
+        <w:tblLayout w:type="fixed"/>
+        <w:tblLook w:firstColumn="1" w:firstRow="1" w:lastColumn="0" w:lastRow="0" w:noHBand="0" w:noVBand="1" w:val="04A0"/>
+        <w:tblBorders>
+          <w:top w:val="single" w:sz="4" w:color="D9D9D9"/>
+          <w:left w:val="single" w:sz="4" w:color="D9D9D9"/>
+          <w:bottom w:val="single" w:sz="4" w:color="D9D9D9"/>
+          <w:right w:val="single" w:sz="4" w:color="D9D9D9"/>
+          <w:insideH w:val="single" w:sz="4" w:color="D9D9D9"/>
+          <w:insideV w:val="single" w:sz="4" w:color="D9D9D9"/>
+        </w:tblBorders>
+      </w:tblPr>
+      <w:tblGrid>
+        <w:gridCol w:w="1701"/>
+        <w:gridCol w:w="4422"/>
+        <w:gridCol w:w="3288"/>
+      </w:tblGrid>
+      <w:tr>
+        <w:trPr>
+          <w:cantSplit/>
+          <w:tblHeader/>
+        </w:trPr>
+        <w:tc>
+          <w:tcPr>
+            <w:tcW w:type="dxa" w:w="1701"/>
+            <w:vAlign w:val="center"/>
+            <w:tcMar>
+              <w:top w:w="85" w:type="dxa"/>
+              <w:left w:w="85" w:type="dxa"/>
+              <w:bottom w:w="85" w:type="dxa"/>
+              <w:right w:w="85" w:type="dxa"/>
+            </w:tcMar>
+            <w:shd w:fill="E7EEF2"/>
+          </w:tcPr>
+          <w:p>
+            <w:pPr>
+              <w:spacing w:line="278" w:lineRule="auto" w:before="100" w:after="100"/>
+              <w:jc w:val="left"/>
+            </w:pPr>
+            <w:r>
+              <w:rPr>
+                <w:b/>
+                <w:color w:val="000000"/>
+                <w:sz w:val="18"/>
+              </w:rPr>
+              <w:t>数据模块</w:t>
+            </w:r>
+          </w:p>
+        </w:tc>
+        <w:tc>
+          <w:tcPr>
+            <w:tcW w:type="dxa" w:w="4422"/>
+            <w:vAlign w:val="center"/>
+            <w:tcMar>
+              <w:top w:w="85" w:type="dxa"/>
+              <w:left w:w="85" w:type="dxa"/>
+              <w:bottom w:w="85" w:type="dxa"/>
+              <w:right w:w="85" w:type="dxa"/>
+            </w:tcMar>
+            <w:shd w:fill="E7EEF2"/>
+          </w:tcPr>
+          <w:p>
+            <w:pPr>
+              <w:spacing w:line="278" w:lineRule="auto" w:before="100" w:after="100"/>
+              <w:jc w:val="left"/>
+            </w:pPr>
+            <w:r>
+              <w:rPr>
+                <w:b/>
+                <w:color w:val="000000"/>
+                <w:sz w:val="18"/>
+              </w:rPr>
+              <w:t>必须保留的字段与用途</w:t>
+            </w:r>
+          </w:p>
+        </w:tc>
+        <w:tc>
+          <w:tcPr>
+            <w:tcW w:type="dxa" w:w="3288"/>
+            <w:vAlign w:val="center"/>
+            <w:tcMar>
+              <w:top w:w="85" w:type="dxa"/>
+              <w:left w:w="85" w:type="dxa"/>
+              <w:bottom w:w="85" w:type="dxa"/>
+              <w:right w:w="85" w:type="dxa"/>
+            </w:tcMar>
+            <w:shd w:fill="E7EEF2"/>
+          </w:tcPr>
+          <w:p>
+            <w:pPr>
+              <w:spacing w:line="278" w:lineRule="auto" w:before="100" w:after="100"/>
+              <w:jc w:val="left"/>
+            </w:pPr>
+            <w:r>
+              <w:rPr>
+                <w:b/>
+                <w:color w:val="000000"/>
+                <w:sz w:val="18"/>
+              </w:rPr>
+              <w:t>不满足条件时的处理</w:t>
+            </w:r>
+          </w:p>
+        </w:tc>
+      </w:tr>
+      <w:tr>
+        <w:trPr>
+          <w:cantSplit/>
+        </w:trPr>
+        <w:tc>
+          <w:tcPr>
+            <w:tcW w:type="dxa" w:w="1701"/>
+            <w:vAlign w:val="center"/>
+            <w:tcMar>
+              <w:top w:w="85" w:type="dxa"/>
+              <w:left w:w="85" w:type="dxa"/>
+              <w:bottom w:w="85" w:type="dxa"/>
+              <w:right w:w="85" w:type="dxa"/>
+            </w:tcMar>
+          </w:tcPr>
+          <w:p>
+            <w:pPr>
+              <w:spacing w:line="278" w:lineRule="auto" w:before="100" w:after="100"/>
+              <w:jc w:val="left"/>
+            </w:pPr>
+            <w:r>
+              <w:rPr>
+                <w:b w:val="0"/>
+                <w:color w:val="000000"/>
+                <w:sz w:val="18"/>
+              </w:rPr>
+              <w:t>氮形态与营养背景</w:t>
+            </w:r>
+          </w:p>
+        </w:tc>
+        <w:tc>
+          <w:tcPr>
+            <w:tcW w:type="dxa" w:w="4422"/>
+            <w:vAlign w:val="center"/>
+            <w:tcMar>
+              <w:top w:w="85" w:type="dxa"/>
+              <w:left w:w="85" w:type="dxa"/>
+              <w:bottom w:w="85" w:type="dxa"/>
+              <w:right w:w="85" w:type="dxa"/>
+            </w:tcMar>
+          </w:tcPr>
+          <w:p>
+            <w:pPr>
+              <w:spacing w:line="278" w:lineRule="auto" w:before="100" w:after="100"/>
+              <w:jc w:val="left"/>
+            </w:pPr>
+            <w:r>
+              <w:rPr>
+                <w:b w:val="0"/>
+                <w:color w:val="000000"/>
+                <w:sz w:val="18"/>
+              </w:rPr>
+              <w:t>NO₃⁻、NH₄⁺分别记录；保留浓度、单位、检出限、采样时间、深度及可获得日期；NO₂⁻与其他营养盐按覆盖补充</w:t>
+            </w:r>
+          </w:p>
+        </w:tc>
+        <w:tc>
+          <w:tcPr>
+            <w:tcW w:type="dxa" w:w="3288"/>
+            <w:vAlign w:val="center"/>
+            <w:tcMar>
+              <w:top w:w="85" w:type="dxa"/>
+              <w:left w:w="85" w:type="dxa"/>
+              <w:bottom w:w="85" w:type="dxa"/>
+              <w:right w:w="85" w:type="dxa"/>
+            </w:tcMar>
+          </w:tcPr>
+          <w:p>
+            <w:pPr>
+              <w:spacing w:line="278" w:lineRule="auto" w:before="100" w:after="100"/>
+              <w:jc w:val="left"/>
+            </w:pPr>
+            <w:r>
+              <w:rPr>
+                <w:b w:val="0"/>
+                <w:color w:val="000000"/>
+                <w:sz w:val="18"/>
+              </w:rPr>
+              <w:t>只有总氮或 DIN 时不反推各形态；缩小为背景分层或暂缓形态假设</w:t>
+            </w:r>
+          </w:p>
+        </w:tc>
+      </w:tr>
+      <w:tr>
+        <w:trPr>
+          <w:cantSplit/>
+        </w:trPr>
+        <w:tc>
+          <w:tcPr>
+            <w:tcW w:type="dxa" w:w="1701"/>
+            <w:vAlign w:val="center"/>
+            <w:tcMar>
+              <w:top w:w="85" w:type="dxa"/>
+              <w:left w:w="85" w:type="dxa"/>
+              <w:bottom w:w="85" w:type="dxa"/>
+              <w:right w:w="85" w:type="dxa"/>
+            </w:tcMar>
+          </w:tcPr>
+          <w:p>
+            <w:pPr>
+              <w:spacing w:line="278" w:lineRule="auto" w:before="100" w:after="100"/>
+              <w:jc w:val="left"/>
+            </w:pPr>
+            <w:r>
+              <w:rPr>
+                <w:b w:val="0"/>
+                <w:color w:val="000000"/>
+                <w:sz w:val="18"/>
+              </w:rPr>
+              <w:t>共污染与陆源输入</w:t>
+            </w:r>
+          </w:p>
+        </w:tc>
+        <w:tc>
+          <w:tcPr>
+            <w:tcW w:type="dxa" w:w="4422"/>
+            <w:vAlign w:val="center"/>
+            <w:tcMar>
+              <w:top w:w="85" w:type="dxa"/>
+              <w:left w:w="85" w:type="dxa"/>
+              <w:bottom w:w="85" w:type="dxa"/>
+              <w:right w:w="85" w:type="dxa"/>
+            </w:tcMar>
+          </w:tcPr>
+          <w:p>
+            <w:pPr>
+              <w:spacing w:line="278" w:lineRule="auto" w:before="100" w:after="100"/>
+              <w:jc w:val="left"/>
+            </w:pPr>
+            <w:r>
+              <w:rPr>
+                <w:b w:val="0"/>
+                <w:color w:val="000000"/>
+                <w:sz w:val="18"/>
+              </w:rPr>
+              <w:t>扑草净等实测污染物浓度与分析方法；降水、径流、土地利用另作输入背景，单独标识代理属性</w:t>
+            </w:r>
+          </w:p>
+        </w:tc>
+        <w:tc>
+          <w:tcPr>
+            <w:tcW w:type="dxa" w:w="3288"/>
+            <w:vAlign w:val="center"/>
+            <w:tcMar>
+              <w:top w:w="85" w:type="dxa"/>
+              <w:left w:w="85" w:type="dxa"/>
+              <w:bottom w:w="85" w:type="dxa"/>
+              <w:right w:w="85" w:type="dxa"/>
+            </w:tcMar>
+          </w:tcPr>
+          <w:p>
+            <w:pPr>
+              <w:spacing w:line="278" w:lineRule="auto" w:before="100" w:after="100"/>
+              <w:jc w:val="left"/>
+            </w:pPr>
+            <w:r>
+              <w:rPr>
+                <w:b w:val="0"/>
+                <w:color w:val="000000"/>
+                <w:sz w:val="18"/>
+              </w:rPr>
+              <w:t>未测不记为零；低于检出限与未采样分别编码；不虚构全球逐日浓度图</w:t>
+            </w:r>
+          </w:p>
+        </w:tc>
+      </w:tr>
+      <w:tr>
+        <w:trPr>
+          <w:cantSplit/>
+        </w:trPr>
+        <w:tc>
+          <w:tcPr>
+            <w:tcW w:type="dxa" w:w="1701"/>
+            <w:vAlign w:val="center"/>
+            <w:tcMar>
+              <w:top w:w="85" w:type="dxa"/>
+              <w:left w:w="85" w:type="dxa"/>
+              <w:bottom w:w="85" w:type="dxa"/>
+              <w:right w:w="85" w:type="dxa"/>
+            </w:tcMar>
+          </w:tcPr>
+          <w:p>
+            <w:pPr>
+              <w:spacing w:line="278" w:lineRule="auto" w:before="100" w:after="100"/>
+              <w:jc w:val="left"/>
+            </w:pPr>
+            <w:r>
+              <w:rPr>
+                <w:b w:val="0"/>
+                <w:color w:val="000000"/>
+                <w:sz w:val="18"/>
+              </w:rPr>
+              <w:t>生态敏感性与局地条件</w:t>
+            </w:r>
+          </w:p>
+        </w:tc>
+        <w:tc>
+          <w:tcPr>
+            <w:tcW w:type="dxa" w:w="4422"/>
+            <w:vAlign w:val="center"/>
+            <w:tcMar>
+              <w:top w:w="85" w:type="dxa"/>
+              <w:left w:w="85" w:type="dxa"/>
+              <w:bottom w:w="85" w:type="dxa"/>
+              <w:right w:w="85" w:type="dxa"/>
+            </w:tcMar>
+          </w:tcPr>
+          <w:p>
+            <w:pPr>
+              <w:spacing w:line="278" w:lineRule="auto" w:before="100" w:after="100"/>
+              <w:jc w:val="left"/>
+            </w:pPr>
+            <w:r>
+              <w:rPr>
+                <w:b w:val="0"/>
+                <w:color w:val="000000"/>
+                <w:sz w:val="18"/>
+              </w:rPr>
+              <w:t>珊瑚类群、深度、既往白化、光照及水交换；按数据来源核查空间和时间代表性</w:t>
+            </w:r>
+          </w:p>
+        </w:tc>
+        <w:tc>
+          <w:tcPr>
+            <w:tcW w:type="dxa" w:w="3288"/>
+            <w:vAlign w:val="center"/>
+            <w:tcMar>
+              <w:top w:w="85" w:type="dxa"/>
+              <w:left w:w="85" w:type="dxa"/>
+              <w:bottom w:w="85" w:type="dxa"/>
+              <w:right w:w="85" w:type="dxa"/>
+            </w:tcMar>
+          </w:tcPr>
+          <w:p>
+            <w:pPr>
+              <w:spacing w:line="278" w:lineRule="auto" w:before="100" w:after="100"/>
+              <w:jc w:val="left"/>
+            </w:pPr>
+            <w:r>
+              <w:rPr>
+                <w:b w:val="0"/>
+                <w:color w:val="000000"/>
+                <w:sz w:val="18"/>
+              </w:rPr>
+              <w:t>不足以匹配时报告适用范围，保留更简化的局地热暴露模型</w:t>
+            </w:r>
+          </w:p>
+        </w:tc>
+      </w:tr>
+      <w:tr>
+        <w:trPr>
+          <w:cantSplit/>
+        </w:trPr>
+        <w:tc>
+          <w:tcPr>
+            <w:tcW w:type="dxa" w:w="1701"/>
+            <w:vAlign w:val="center"/>
+            <w:tcMar>
+              <w:top w:w="85" w:type="dxa"/>
+              <w:left w:w="85" w:type="dxa"/>
+              <w:bottom w:w="85" w:type="dxa"/>
+              <w:right w:w="85" w:type="dxa"/>
+            </w:tcMar>
+          </w:tcPr>
+          <w:p>
+            <w:pPr>
+              <w:spacing w:line="278" w:lineRule="auto" w:before="100" w:after="100"/>
+              <w:jc w:val="left"/>
+            </w:pPr>
+            <w:r>
+              <w:rPr>
+                <w:b w:val="0"/>
+                <w:color w:val="000000"/>
+                <w:sz w:val="18"/>
+              </w:rPr>
+              <w:t>机制核查</w:t>
+            </w:r>
+          </w:p>
+        </w:tc>
+        <w:tc>
+          <w:tcPr>
+            <w:tcW w:type="dxa" w:w="4422"/>
+            <w:vAlign w:val="center"/>
+            <w:tcMar>
+              <w:top w:w="85" w:type="dxa"/>
+              <w:left w:w="85" w:type="dxa"/>
+              <w:bottom w:w="85" w:type="dxa"/>
+              <w:right w:w="85" w:type="dxa"/>
+            </w:tcMar>
+          </w:tcPr>
+          <w:p>
+            <w:pPr>
+              <w:spacing w:line="278" w:lineRule="auto" w:before="100" w:after="100"/>
+              <w:jc w:val="left"/>
+            </w:pPr>
+            <w:r>
+              <w:rPr>
+                <w:b w:val="0"/>
+                <w:color w:val="000000"/>
+                <w:sz w:val="18"/>
+              </w:rPr>
+              <w:t>独立实验中的共生藻、光合状态、氧化应激或脂质指标，用于检验选定解释</w:t>
+            </w:r>
+          </w:p>
+        </w:tc>
+        <w:tc>
+          <w:tcPr>
+            <w:tcW w:type="dxa" w:w="3288"/>
+            <w:vAlign w:val="center"/>
+            <w:tcMar>
+              <w:top w:w="85" w:type="dxa"/>
+              <w:left w:w="85" w:type="dxa"/>
+              <w:bottom w:w="85" w:type="dxa"/>
+              <w:right w:w="85" w:type="dxa"/>
+            </w:tcMar>
+          </w:tcPr>
+          <w:p>
+            <w:pPr>
+              <w:spacing w:line="278" w:lineRule="auto" w:before="100" w:after="100"/>
+              <w:jc w:val="left"/>
+            </w:pPr>
+            <w:r>
+              <w:rPr>
+                <w:b w:val="0"/>
+                <w:color w:val="000000"/>
+                <w:sz w:val="18"/>
+              </w:rPr>
+              <w:t>不作为全球业务预测中默认可获得的输入，也不从统计重要性反推这些指标</w:t>
+            </w:r>
+          </w:p>
+        </w:tc>
+      </w:tr>
+    </w:tbl>
+    <w:p>
+      <w:pPr>
+        <w:widowControl/>
+        <w:spacing w:before="140"/>
+        <w:jc w:val="both"/>
+      </w:pPr>
+      <w:r>
+        <w:rPr>
+          <w:b w:val="0"/>
+        </w:rPr>
+        <w:t>真实接入先核查观测能否支持目标日标签。若调查频率只能支持事件或季节尺度，应单独定义该尺度的任务，再讨论是否需要新增随访；不能用插值生成的白化日期维持日尺度预警设定。</w:t>
+      </w:r>
+    </w:p>
+    <w:p>
+      <w:pPr>
+        <w:pStyle w:val="Heading2"/>
+      </w:pPr>
+      <w:r>
+        <w:rPr>
+          <w:b w:val="0"/>
+          <w:color w:val="000000"/>
+          <w:u w:val="none"/>
+        </w:rPr>
+        <w:t>2.5 真实礁区分布与预测空间</w:t>
+      </w:r>
+    </w:p>
+    <w:p>
+      <w:pPr>
+        <w:widowControl/>
+        <w:jc w:val="both"/>
+      </w:pPr>
+      <w:r>
+        <w:rPr>
+          <w:b w:val="0"/>
+        </w:rPr>
+        <w:t>Allen Coral Atlas 提供基于遥感制图的真实浅水珊瑚礁范围、地貌分区和底栖栖息地资料，可用于确定研究区域、配对环境网格及组织调查抽样。[15] 其覆盖受水深和水体透明度限制；底栖分类中的 coral/algae 为合并类别，不能解释为逐像元的活珊瑚覆盖率。[16] 礁区分布说明研究对象可能位于何处，白化与后续结局仍由各自的观测定义。</w:t>
+      </w:r>
+    </w:p>
+    <w:p>
+      <w:pPr>
+        <w:widowControl/>
+        <w:jc w:val="both"/>
+      </w:pPr>
+      <w:r>
+        <w:t>Demo 已提供可缩放的真实地理底图、Atlas 官方站点定位入口及独立的在线地貌图层开关。2026 年 10 月 18 日核验时，官方图层目录可读，但地图图片请求返回 403，故默认关闭并显示加载状态，不以合成分布替代。未镜像或再分发全球数据。5 米栖息地像元不能把较粗热暴露数据变成同等精度的预测；历史验证还需审计制图版本的可获得日期。</w:t>
+      </w:r>
+    </w:p>
+    <w:p>
+      <w:pPr>
+        <w:widowControl/>
+        <w:jc w:val="both"/>
+      </w:pPr>
+      <w:r>
+        <w:rPr>
+          <w:b w:val="0"/>
+        </w:rPr>
+        <w:t>数据获取可使用官方提供的下载或地理服务。地图、测深及统计数据按官方所列 CC BY 4.0 条件署名；Planet 卫星影像另有许可，不能与派生地图混用授权。[16] 工程保留来源与版本说明，按实际所用产品核查引用和再分发条件。</w:t>
+      </w:r>
+    </w:p>
+    <w:p>
+      <w:pPr>
         <w:pStyle w:val="Heading1"/>
         <w:jc w:val="left"/>
       </w:pPr>
       <w:r>
         <w:rPr>
           <w:b w:val="0"/>
+          <w:color w:val="000000"/>
+          <w:u w:val="none"/>
         </w:rPr>
         <w:t>三、待检验的假设与实验职责</w:t>
       </w:r>
@@ -723,6 +1912,8 @@
       <w:r>
         <w:rPr>
           <w:b w:val="0"/>
+          <w:color w:val="000000"/>
+          <w:u w:val="none"/>
         </w:rPr>
         <w:t>3.1 复合环境与敏感性是否改变排序</w:t>
       </w:r>
@@ -735,7 +1926,31 @@
         <w:rPr>
           <w:b w:val="0"/>
         </w:rPr>
-        <w:t>H1：在局地热压力相近的样本中，光照及可获得的生态敏感性信息能提供额外的白化区分能力。比较局地热应激模型、加入其他局地条件的加性模型与包含预设交互项的模型，在一致的外层划分下评价。若增益在区域外验证中消失，或被调查方法、深度和监测强度差异解释，则不支持该条件下的增量价值。交互项用于描述统计关系，不直接等于生理机制。</w:t>
+        <w:t>H1：在热暴露及主要生态背景相近时，分别纳入硝酸盐与铵盐的信息，比仅使用合并营养盐指标更能区分未来白化风险。比较局地热暴露模型、加入光照和生态背景的模型、增加氮形态的加性模型，以及包含预登记热暴露×氮形态交互项的模型。各比较使用共同可用样本、相同外层划分和匹配的调参预算，并单独报告加入变量造成的样本覆盖变化。</w:t>
+      </w:r>
+    </w:p>
+    <w:p>
+      <w:pPr>
+        <w:widowControl/>
+        <w:jc w:val="both"/>
+      </w:pPr>
+      <w:r>
+        <w:rPr>
+          <w:b w:val="0"/>
+        </w:rPr>
+        <w:t>有实测扑草净时，再检验其与硝酸盐的交互是否提供增量信息。热胁迫×氮形态×扑草净的三重交互作为后续探索项，需有足够共同暴露样本和独立确认数据；所供实验尚未直接验证这一组合。实验文献中的方向用于提出假设，不强制模型只能得到该方向。</w:t>
+      </w:r>
+    </w:p>
+    <w:p>
+      <w:pPr>
+        <w:widowControl/>
+        <w:jc w:val="both"/>
+      </w:pPr>
+      <w:r>
+        <w:rPr>
+          <w:b w:val="0"/>
+        </w:rPr>
+        <w:t>若氮形态的增益在区域外验证中消失，或可由调查方法、深度、类群及监测强度解释，则不支持该条件下的预警增量价值。即使交互项提高预测质量，其过程解释仍需独立观测或实验。铵盐相关结果限定于研究的浓度和环境范围，不作为环境施加建议。</w:t>
       </w:r>
     </w:p>
     <w:p>
@@ -746,6 +1961,8 @@
       <w:r>
         <w:rPr>
           <w:b w:val="0"/>
+          <w:color w:val="000000"/>
+          <w:u w:val="none"/>
         </w:rPr>
         <w:t>3.2 先行环境信息是否超出局地解释</w:t>
       </w:r>
@@ -780,6 +1997,8 @@
       <w:r>
         <w:rPr>
           <w:b w:val="0"/>
+          <w:color w:val="000000"/>
+          <w:u w:val="none"/>
         </w:rPr>
         <w:t>3.3 可迁移性与预算选择分别检验</w:t>
       </w:r>
@@ -814,6 +2033,8 @@
       <w:r>
         <w:rPr>
           <w:b w:val="0"/>
+          <w:color w:val="000000"/>
+          <w:u w:val="none"/>
         </w:rPr>
         <w:t>四、Agent 环境与可执行接口</w:t>
       </w:r>
@@ -826,6 +2047,8 @@
       <w:r>
         <w:rPr>
           <w:b w:val="0"/>
+          <w:color w:val="000000"/>
+          <w:u w:val="none"/>
         </w:rPr>
         <w:t>4.1 大模型规划、科学模型计算、评估器守界</w:t>
       </w:r>
@@ -846,10 +2069,7 @@
         <w:jc w:val="both"/>
       </w:pPr>
       <w:r>
-        <w:rPr>
-          <w:b w:val="0"/>
-        </w:rPr>
-        <w:t>在运行前固定目标定义、数据版本、提前期、候选空间、训练/验证/测试分区、预算、效用与负对照。Agent 可以选择下一项未测试候选，不能改写标签、测试单元、基线或判定门槛。候选由三种路线（局地、邻域、方向性）、四种环境滞后（0/7/14/30 天）和两种 Logistic 表达（加性、含交互项）组合而成，共 24 项。</w:t>
+        <w:t>在运行前固定目标定义、数据版本、提前期、候选空间、训练/验证/测试分区、预算、效用与负对照。Agent 可以选择下一项未测试候选，不能改写标签、测试单元、基线或判定门槛。时滞与空间信号路线保留三种路线、四种滞后与两种 Logistic 表达，共 24 项。新增化学路线采用同一 Logistic 拟合器，比较热暴露背景、合并氮指标、氮形态、热与氮交互、共污染五组变量方案，各配四种滞后。完整字段为 20 项，缺污染物为 16 项，仅合并氮指标为 8 项；数据不足的模型被排除。</w:t>
       </w:r>
     </w:p>
     <w:p>
@@ -857,13 +2077,13 @@
         <w:jc w:val="both"/>
       </w:pPr>
       <w:r>
-        <w:rPr>
-          <w:b w:val="0"/>
-        </w:rPr>
-        <w:t>本版网页在浏览器中实际生成合成时间序列、拟合模型并计算指标。数据生成器定义 12 个抽象礁区、740 天和 8,880 条日记录，使用局地热压力、光照、敏感性与抽象相连单元的先前信号生成二元状态。该设计用于检查代码是否运行、时间索引是否一致以及不同候选能否产生不同结果；生成器不是珊瑚生理模型，抽象连接也不是观测流场。</w:t>
+        <w:t>本版网页在浏览器中生成合成时间序列、拟合并评分。空间路线生成器定义 12 个抽象礁区、740 天和 8,880 条日记录，使用局地热压力、光照、敏感性与抽象相连单元的先前信号生成二元状态。该设计用于检查代码是否运行、时间索引是否一致以及不同候选能否产生不同结果；生成器不是珊瑚生理模型，抽象连接也不是观测流场。</w:t>
       </w:r>
     </w:p>
     <w:p>
+      <w:pPr>
+        <w:keepNext/>
+      </w:pPr>
       <w:r>
         <w:drawing>
           <wp:inline xmlns:a="http://schemas.openxmlformats.org/drawingml/2006/main" xmlns:pic="http://schemas.openxmlformats.org/drawingml/2006/picture">
@@ -919,6 +2139,8 @@
       <w:r>
         <w:rPr>
           <w:b w:val="0"/>
+          <w:color w:val="000000"/>
+          <w:u w:val="none"/>
         </w:rPr>
         <w:t>4.2 观察、行动、反馈与停止</w:t>
       </w:r>
@@ -1098,11 +2320,7 @@
               <w:spacing w:after="100" w:before="100" w:line="283" w:lineRule="auto"/>
             </w:pPr>
             <w:r>
-              <w:rPr>
-                <w:b w:val="0"/>
-                <w:sz w:val="18"/>
-              </w:rPr>
-              <w:t>本版为加性与交互项 Logistic；拒绝未知模型</w:t>
+              <w:t>按研究路线和可用字段筛选模型；拒绝未知模型</w:t>
             </w:r>
           </w:p>
         </w:tc>
@@ -1193,11 +2411,7 @@
               <w:spacing w:after="100" w:before="100" w:line="283" w:lineRule="auto"/>
             </w:pPr>
             <w:r>
-              <w:rPr>
-                <w:b w:val="0"/>
-                <w:sz w:val="18"/>
-              </w:rPr>
-              <w:t>为已运行候选提出反向或错时对照</w:t>
+              <w:t>为已运行候选提出该路线对应的两种对照</w:t>
             </w:r>
           </w:p>
         </w:tc>
@@ -1333,6 +2547,8 @@
       <w:r>
         <w:rPr>
           <w:b w:val="0"/>
+          <w:color w:val="000000"/>
+          <w:u w:val="none"/>
         </w:rPr>
         <w:t>4.3 三段隔离与泄漏检查</w:t>
       </w:r>
@@ -1372,12 +2588,48 @@
     </w:p>
     <w:p>
       <w:pPr>
+        <w:pStyle w:val="Heading2"/>
+      </w:pPr>
+      <w:r>
+        <w:rPr>
+          <w:b w:val="0"/>
+          <w:color w:val="000000"/>
+          <w:u w:val="none"/>
+        </w:rPr>
+        <w:t>4.4 将研究依据用于规划和模型选择</w:t>
+      </w:r>
+    </w:p>
+    <w:p>
+      <w:pPr>
+        <w:widowControl/>
+        <w:jc w:val="both"/>
+      </w:pPr>
+      <w:r>
+        <w:rPr>
+          <w:b w:val="0"/>
+        </w:rPr>
+        <w:t>真实数据阶段为已核实论文建立简短证据条目，记录研究对象、暴露条件、观测终点、支持的假设及限制。大模型读取这些条目与当前数据摘要后，先判断哪些问题具备可检验条件，再从预登记模型池选择。例如，只有硝酸盐记录时可检验其附加信息，但不能宣称已比较硝酸盐与铵盐；只有土地利用代理时只能研究输入背景，不能输出扑草净暴露结论。</w:t>
+      </w:r>
+    </w:p>
+    <w:p>
+      <w:pPr>
+        <w:widowControl/>
+        <w:jc w:val="both"/>
+      </w:pPr>
+      <w:r>
+        <w:t>证据条目提供候选依据，预测分数由数值模型计算，模型参数由训练资料估计。规划日志记录本次选择所依据的来源、可用变量、拟合成本和拟排除的解释；矛盾结果同样保留。新增氮形态或污染物模型须在测试开启前登记，并为其设置匹配对照。Demo 现已接入七条文献证据摘要及化学候选目录。来源只提供假设依据，浓度和标签仍为合成。化学路线另设移除化学信息与错时输入对照，不能据预测差异宣称因果机制成立。</w:t>
+      </w:r>
+    </w:p>
+    <w:p>
+      <w:pPr>
         <w:pStyle w:val="Heading1"/>
         <w:jc w:val="left"/>
       </w:pPr>
       <w:r>
         <w:rPr>
           <w:b w:val="0"/>
+          <w:color w:val="000000"/>
+          <w:u w:val="none"/>
         </w:rPr>
         <w:t>五、什么结果才支持科学主张</w:t>
       </w:r>
@@ -1390,6 +2642,8 @@
       <w:r>
         <w:rPr>
           <w:b w:val="0"/>
+          <w:color w:val="000000"/>
+          <w:u w:val="none"/>
         </w:rPr>
         <w:t>5.1 基线与负对照</w:t>
       </w:r>
@@ -1399,10 +2653,7 @@
         <w:jc w:val="both"/>
       </w:pPr>
       <w:r>
-        <w:rPr>
-          <w:b w:val="0"/>
-        </w:rPr>
-        <w:t>本版已执行的参照包括训练发生率、固定局地加性 Logistic、同预算随机搜索，以及预设“方向性/滞后 7 天/交互项”候选的正向、反向和输入额外提前 31 天对照。时间对照保持所有输入在预测起点以前，不作为完整置换显著性检验。方向对照固定注册，不能事后改用最有利的候选来展示。</w:t>
+        <w:t>空间路线已执行的参照包括训练发生率、固定局地加性 Logistic、同预算随机搜索，以及预设“方向性/滞后 7 天/交互项”候选的正向、反向和输入额外提前 31 天对照。时间对照保持所有输入在预测起点以前，不作为完整置换显著性检验。方向对照固定注册，不能事后改用最有利的候选来展示。</w:t>
       </w:r>
     </w:p>
     <w:p>
@@ -1424,6 +2675,8 @@
       <w:r>
         <w:rPr>
           <w:b w:val="0"/>
+          <w:color w:val="000000"/>
+          <w:u w:val="none"/>
         </w:rPr>
         <w:t>5.2 评价与判定</w:t>
       </w:r>
@@ -1463,12 +2716,51 @@
     </w:p>
     <w:p>
       <w:pPr>
+        <w:pStyle w:val="Heading2"/>
+      </w:pPr>
+      <w:r>
+        <w:rPr>
+          <w:b w:val="0"/>
+          <w:color w:val="000000"/>
+          <w:u w:val="none"/>
+        </w:rPr>
+        <w:t>5.3 区分预测验证与过程核查</w:t>
+      </w:r>
+    </w:p>
+    <w:p>
+      <w:pPr>
+        <w:widowControl/>
+        <w:jc w:val="both"/>
+      </w:pPr>
+      <w:r>
+        <w:rPr>
+          <w:b w:val="0"/>
+        </w:rPr>
+        <w:t>首轮真实研究可优先审计北部南海等已有长期生态背景研究的区域，但进入短期预警研究仍取决于原始数据访问、白化调查日期和环境观测是否满足要求。[8] 先在有共同观测的样本上比较热暴露、局地背景、氮形态和共污染模型，再用未参与选择的区域或事件检验。逐项移除新增因子，检查其是否改变风险排序、概率质量及固定容量下的调查命中；不能仅凭拟合优度或变量重要性宣称增益。</w:t>
+      </w:r>
+    </w:p>
+    <w:p>
+      <w:pPr>
+        <w:widowControl/>
+        <w:jc w:val="both"/>
+      </w:pPr>
+      <w:r>
+        <w:rPr>
+          <w:b w:val="0"/>
+        </w:rPr>
+        <w:t>预测改善后，再针对最稳定的条件差异开展独立核查。例如，用与现场物种和浓度相容的实验检验氮形态差异，或用原位温度与流场记录核查先行信号。脂质响应、污染物毒性及水团交换分别需要相应过程证据。研究最终应区分三类结果：在何处改善预警，哪些环境组合值得补充观测，以及哪些过程解释获得独立支持。</w:t>
+      </w:r>
+    </w:p>
+    <w:p>
+      <w:pPr>
         <w:pStyle w:val="Heading1"/>
         <w:jc w:val="left"/>
       </w:pPr>
       <w:r>
         <w:rPr>
           <w:b w:val="0"/>
+          <w:color w:val="000000"/>
+          <w:u w:val="none"/>
         </w:rPr>
         <w:t>六、当前 Demo 的可复现结果与展示范围</w:t>
       </w:r>
@@ -1481,6 +2773,8 @@
       <w:r>
         <w:rPr>
           <w:b w:val="0"/>
+          <w:color w:val="000000"/>
+          <w:u w:val="none"/>
         </w:rPr>
         <w:t>6.1 固定配置的实际运行</w:t>
       </w:r>
@@ -1995,6 +3289,9 @@
       </w:r>
     </w:p>
     <w:p>
+      <w:pPr>
+        <w:keepNext/>
+      </w:pPr>
       <w:r>
         <w:drawing>
           <wp:inline xmlns:a="http://schemas.openxmlformats.org/drawingml/2006/main" xmlns:pic="http://schemas.openxmlformats.org/drawingml/2006/picture">
@@ -2050,6 +3347,8 @@
       <w:r>
         <w:rPr>
           <w:b w:val="0"/>
+          <w:color w:val="000000"/>
+          <w:u w:val="none"/>
         </w:rPr>
         <w:t>6.2 多种子比较限定效率主张</w:t>
       </w:r>
@@ -2084,6 +3383,8 @@
       <w:r>
         <w:rPr>
           <w:b w:val="0"/>
+          <w:color w:val="000000"/>
+          <w:u w:val="none"/>
         </w:rPr>
         <w:t>6.3 网站可演示的内容</w:t>
       </w:r>
@@ -2096,7 +3397,7 @@
         <w:rPr>
           <w:b w:val="0"/>
         </w:rPr>
-        <w:t>全球风险页使用真实的 Natural Earth 陆地轮廓，显示 12 个地理演示锚点；数值、调查、事件报告与随访记录均为合成内容。首页的 0–100 风险量由公开的情景公式生成，与实验室拟合概率分别计算。切换提前期、海盆、证据图层和站点，调整热压力、光照或交换条件，均不会把缺失白化证据改写成确认事件。</w:t>
+        <w:t>全球风险页使用真实的 Natural Earth 陆地轮廓，[7] 显示 12 个地理演示锚点；数值、调查、事件报告与随访记录均为合成内容。首页的 0–100 风险量由公开的情景公式生成，与实验室拟合概率分别计算。切换提前期、海盆、证据图层和站点，调整热压力、光照或交换条件，均不会把缺失白化证据改写成确认事件。</w:t>
       </w:r>
     </w:p>
     <w:p>
@@ -2104,10 +3405,16 @@
         <w:jc w:val="both"/>
       </w:pPr>
       <w:r>
-        <w:rPr>
-          <w:b w:val="0"/>
-        </w:rPr>
-        <w:t>实验室页面运行 24 候选空间中的预算探索。规则模式返回完整轨迹、预算—最佳效用曲线、随机参照、封存测试与发现卡。真实大模型模式提供研究问题输入、模型目录、真实连接检查、工具行动时间线、实验计数和冻结后的独立评估；需通过工程服务端配置密钥，静态托管不执行服务端模型调用。当前通过的是协议和模拟服务测试；未提供用户密钥，尚未完成远程模型实测。两类结果均可导出 JSON。站点卡、优先清单与简报可分别导出。地图不表示全球礁区完整覆盖；没有接入实时 NOAA 数据、真实白化照片识别、酸化/风暴过程模型或死亡预测器。生态后果页只用独立的模拟随访案例说明所需证据。</w:t>
+        <w:t>实验室页面提供时滞与空间信号、氮形态与共污染两条路线。规则模式返回完整轨迹、预算—最佳效用曲线、随机参照、封存测试与发现卡。真实大模型模式提供研究问题输入、模型目录、真实连接检查、工具行动时间线、实验计数和冻结后的独立评估；需通过工程服务端配置密钥，静态托管不执行服务端模型调用。当前通过的是协议和模拟服务测试；未提供用户密钥，尚未完成远程模型实测。两类结果均可导出 JSON。站点卡、优先清单与简报可分别导出。地图不表示全球礁区完整覆盖；没有接入实时 NOAA 数据、真实白化照片识别、酸化/风暴过程模型或死亡预测器。生态后果页只用独立的模拟随访案例说明所需证据。</w:t>
+      </w:r>
+    </w:p>
+    <w:p>
+      <w:pPr>
+        <w:widowControl/>
+        <w:jc w:val="both"/>
+      </w:pPr>
+      <w:r>
+        <w:t>新增化学合成器版本为 coralbleach-compound-v1.1.0，独立于第六节空间路线结果，不改写旧分数。网站增加固定合并氮浓度下的形态比较图、模型可用性展示，以及无化学增量和区域效应改变两类反例情景。化学字段和响应方向由合成公式设定，系数没有从论文提取；页面指数及实验分数均不能验证这些因子的真实珊瑚效应。</w:t>
       </w:r>
     </w:p>
     <w:p>
@@ -2118,6 +3425,8 @@
       <w:r>
         <w:rPr>
           <w:b w:val="0"/>
+          <w:color w:val="000000"/>
+          <w:u w:val="none"/>
         </w:rPr>
         <w:t>七、从 GlobalHAB-Agent 到珊瑚版本</w:t>
       </w:r>
@@ -2197,10 +3506,7 @@
         <w:jc w:val="both"/>
       </w:pPr>
       <w:r>
-        <w:rPr>
-          <w:b w:val="0"/>
-        </w:rPr>
-        <w:t>下一阶段先用实际服务端密钥完成远程大模型闭环及成本记录，再完成一个区域的标签审计和时间可获得性表，再接入环境数据与独立调查。第二阶段固定目标和评价协议，增加匹配的强基线、校准集、事件块区间与区域外留出。第三阶段在相同预算下比较搜索策略，并通过独立流场或原位记录核查方向假设。只有具备重复随访后，才新增持续、恢复与死亡任务。</w:t>
+        <w:t>下一阶段先完成一个区域的标签和变量审计，确认是否能够匹配白化观测、局地热暴露及氮形态；原始数据的可访问性与再使用许可单独核查。同时完成服务端远程大模型闭环及成本记录。固定预测目标、比较样本和评价协议后，将合成候选迁移至具备观测的数据子集，再加入强基线、独立校准和区域外验证。随后统一搜索策略的总实验预算，并对稳定的方向或交互关系安排独立过程核查。只有具备重复随访后，才新增持续、恢复与死亡任务。</w:t>
       </w:r>
     </w:p>
     <w:p>
@@ -2222,6 +3528,8 @@
       <w:r>
         <w:rPr>
           <w:b w:val="0"/>
+          <w:color w:val="000000"/>
+          <w:u w:val="none"/>
         </w:rPr>
         <w:t>参考资料</w:t>
       </w:r>
@@ -2319,6 +3627,7 @@
     </w:p>
     <w:p>
       <w:pPr>
+        <w:widowControl/>
         <w:spacing w:line="264" w:lineRule="auto" w:after="120"/>
         <w:jc w:val="left"/>
       </w:pPr>
@@ -2327,7 +3636,119 @@
           <w:b w:val="0"/>
           <w:sz w:val="18"/>
         </w:rPr>
-        <w:t>资料核查日期：2026 年 10 月 18 日。网页和文献仅承担各自标注的论证职责；本版数值结果来自随工程保存的合成运行记录。</w:t>
+        <w:t>[8] Xu, H., et al. Impacts of local anthropogenic stressors outpace those of climate on coral reef collapse in the northern South China Sea. Nature Communications 17, 4136 (2026). https://doi.org/10.1038/s41467-026-70760-1 。用于区域背景与长期活珊瑚覆盖变化；不作为短期白化标签。</w:t>
+      </w:r>
+    </w:p>
+    <w:p>
+      <w:pPr>
+        <w:widowControl/>
+        <w:spacing w:line="264" w:lineRule="auto" w:after="120"/>
+        <w:jc w:val="left"/>
+      </w:pPr>
+      <w:r>
+        <w:rPr>
+          <w:b w:val="0"/>
+          <w:sz w:val="18"/>
+        </w:rPr>
+        <w:t>[9] Zhang, J., Kang, W., et al. Nitrate Aggravates While Ammonium Mitigates Thermal Bleaching in Corals through Divergent Lipid-Mediated Pathways and Stress Response. Environmental Science &amp; Technology 60, 1699–1712 (2026). https://doi.org/10.1021/acs.est.5c13276 。用于氮形态与热白化交互的实验依据。</w:t>
+      </w:r>
+    </w:p>
+    <w:p>
+      <w:pPr>
+        <w:widowControl/>
+        <w:spacing w:line="264" w:lineRule="auto" w:after="120"/>
+        <w:jc w:val="left"/>
+      </w:pPr>
+      <w:r>
+        <w:rPr>
+          <w:b w:val="0"/>
+          <w:sz w:val="18"/>
+        </w:rPr>
+        <w:t>[10] Li, Q., et al. Environmental Concentrations of Herbicide Prometryn Increase the Susceptibility of Reef-Building Corals to Nitrate Stress. Environmental Science &amp; Technology 60, 16552–16565 (2026). https://doi.org/10.1021/acs.est.6c06486 。用于扑草净与硝酸盐复合暴露的实验依据。</w:t>
+      </w:r>
+    </w:p>
+    <w:p>
+      <w:pPr>
+        <w:widowControl/>
+        <w:spacing w:line="264" w:lineRule="auto" w:after="120"/>
+        <w:jc w:val="left"/>
+      </w:pPr>
+      <w:r>
+        <w:rPr>
+          <w:b w:val="0"/>
+          <w:sz w:val="18"/>
+        </w:rPr>
+        <w:t>[11] Liu, H., et al. Marine Heatwaves and Iceberg Melting in Polar Areas Intensify Phytoplankton Blooms. Global Change Biology 31, e70132 (2025). https://doi.org/10.1111/gcb.70132 。用于资源背景与复合暴露分析的前期研究基础。</w:t>
+      </w:r>
+    </w:p>
+    <w:p>
+      <w:pPr>
+        <w:widowControl/>
+        <w:spacing w:line="264" w:lineRule="auto" w:after="120"/>
+        <w:jc w:val="left"/>
+      </w:pPr>
+      <w:r>
+        <w:rPr>
+          <w:b w:val="0"/>
+          <w:sz w:val="18"/>
+        </w:rPr>
+        <w:t>[12] Liu, H., et al. Anomalies of Net Primary Productivity under Compound Marine Heatwaves and Microplastics. Environmental Science &amp; Technology 60, 23294–23305 (2026). https://doi.org/10.1021/acs.est.6c02934 。用于背景依赖与暴露响应空间错位的前期研究基础。</w:t>
+      </w:r>
+    </w:p>
+    <w:p>
+      <w:pPr>
+        <w:widowControl/>
+        <w:spacing w:line="264" w:lineRule="auto" w:after="120"/>
+        <w:jc w:val="left"/>
+      </w:pPr>
+      <w:r>
+        <w:rPr>
+          <w:b w:val="0"/>
+          <w:sz w:val="18"/>
+        </w:rPr>
+        <w:t>[13] Liu, H., et al. Global Characterization of Sea Turtle Ecological Traps under Compound Marine Heatwaves and Microplastics. Environmental Science &amp; Technology 60, 17888–17899 (2026). https://doi.org/10.1021/acs.est.6c02104 。用于表观状态与生态后果区分的前期研究基础。</w:t>
+      </w:r>
+    </w:p>
+    <w:p>
+      <w:pPr>
+        <w:widowControl/>
+        <w:spacing w:line="264" w:lineRule="auto" w:after="120"/>
+        <w:jc w:val="left"/>
+      </w:pPr>
+      <w:r>
+        <w:rPr>
+          <w:b w:val="0"/>
+          <w:sz w:val="18"/>
+        </w:rPr>
+        <w:t>[14] Li, Z., Liu, H., Dong, X. &amp; Hu, X. Decreases in South Pacific and South Atlantic sea-air CO₂ fluxes caused by extreme precipitation. Nature Communications 17, 3011 (2026). https://doi.org/10.1038/s41467-026-69847-6 。项目提出者为第二作者；用于遗漏环境因子与判断偏差的前期研究基础。</w:t>
+      </w:r>
+    </w:p>
+    <w:p>
+      <w:pPr>
+        <w:widowControl/>
+        <w:spacing w:line="264" w:lineRule="auto" w:after="120"/>
+        <w:jc w:val="left"/>
+      </w:pPr>
+      <w:r>
+        <w:rPr>
+          <w:b w:val="0"/>
+          <w:sz w:val="18"/>
+        </w:rPr>
+        <w:t>[15] Allen Coral Atlas. Science &amp; Methods. https://allencoralatlas.org/methods/ 。用于礁区范围、栖息地制图尺度与覆盖边界。地图入口：https://www.allencoralatlas.org/atlas/ 。</w:t>
+      </w:r>
+    </w:p>
+    <w:p>
+      <w:pPr>
+        <w:widowControl/>
+        <w:spacing w:line="264" w:lineRule="auto" w:after="120"/>
+        <w:jc w:val="left"/>
+      </w:pPr>
+      <w:r>
+        <w:rPr>
+          <w:b w:val="0"/>
+          <w:sz w:val="18"/>
+        </w:rPr>
+        <w:t>[16] Allen Coral Atlas. Resources and FAQ. https://allencoralatlas.org/resources/ 。用于 coral/algae 类别解释、数据服务、署名与不同产品的许可说明。访问日期为 2026 年 10 月 18 日。</w:t>
       </w:r>
     </w:p>
     <w:sectPr>
@@ -2342,6 +3763,59 @@
 </w:document>
 </file>
 
+<file path=word/comments.xml><?xml version="1.0" encoding="utf-8"?>
+<w:comments xmlns:a="http://schemas.openxmlformats.org/drawingml/2006/main" xmlns:pic="http://schemas.openxmlformats.org/drawingml/2006/picture" xmlns:r="http://schemas.openxmlformats.org/officeDocument/2006/relationships" xmlns:w="http://schemas.openxmlformats.org/wordprocessingml/2006/main" xmlns:wp="http://schemas.openxmlformats.org/drawingml/2006/wordprocessingDrawing" xmlns:mc="http://schemas.openxmlformats.org/markup-compatibility/2006" xmlns:a14="http://schemas.microsoft.com/office/drawing/2010/main" xmlns:w14="http://schemas.microsoft.com/office/word/2010/wordml" xmlns:wpc="http://schemas.microsoft.com/office/word/2010/wordprocessingCanvas">
+  <w:comment w:id="0" w:author="修订说明" w:initials="R" w:date="2026-10-18T09:15:06Z">
+    <w:p>
+      <w:pPr>
+        <w:pStyle w:val="CommentText"/>
+      </w:pPr>
+      <w:r>
+        <w:rPr>
+          <w:rStyle w:val="CommentReference"/>
+        </w:rPr>
+        <w:annotationRef/>
+      </w:r>
+      <w:r>
+        <w:t>本段引入珊瑚野外研究，并保留活珊瑚覆盖与短期白化的终点区别。所供材料中的卷号和文章号已按出版信息校正为 17, 4136。</w:t>
+      </w:r>
+    </w:p>
+  </w:comment>
+  <w:comment w:id="1" w:author="修订说明" w:initials="R" w:date="2026-10-18T09:15:06Z">
+    <w:p>
+      <w:pPr>
+        <w:pStyle w:val="CommentText"/>
+      </w:pPr>
+      <w:r>
+        <w:rPr>
+          <w:rStyle w:val="CommentReference"/>
+        </w:rPr>
+        <w:annotationRef/>
+      </w:r>
+      <w:r>
+        <w:t>四篇论文用于说明前期研究积累和迁移思路。所供三项珊瑚研究暂按外部依据引用，避免未经确认将其署名或数据归属写入项目成果。</w:t>
+      </w:r>
+    </w:p>
+  </w:comment>
+  <w:comment w:id="2" w:author="修订说明" w:initials="R" w:date="2026-10-18T09:15:06Z">
+    <w:p>
+      <w:pPr>
+        <w:pStyle w:val="CommentText"/>
+      </w:pPr>
+      <w:r>
+        <w:rPr>
+          <w:rStyle w:val="CommentReference"/>
+        </w:rPr>
+        <w:annotationRef/>
+      </w:r>
+      <w:r>
+        <w:t>本次为研究定义修订；网站、模型池及原合成运行分数未改动。</w:t>
+      </w:r>
+    </w:p>
+  </w:comment>
+</w:comments>
+</file>
+
 <file path=word/footer1.xml><?xml version="1.0" encoding="utf-8"?>
 <w:ftr xmlns:m="http://schemas.openxmlformats.org/officeDocument/2006/math" xmlns:mc="http://schemas.openxmlformats.org/markup-compatibility/2006" xmlns:mo="http://schemas.microsoft.com/office/mac/office/2008/main" xmlns:mv="urn:schemas-microsoft-com:mac:vml" xmlns:o="urn:schemas-microsoft-com:office:office" xmlns:r="http://schemas.openxmlformats.org/officeDocument/2006/relationships" xmlns:v="urn:schemas-microsoft-com:vml" xmlns:w10="urn:schemas-microsoft-com:office:word" xmlns:w14="http://schemas.microsoft.com/office/word/2010/wordml" xmlns:w="http://schemas.openxmlformats.org/wordprocessingml/2006/main" xmlns:wne="http://schemas.microsoft.com/office/word/2006/wordml" xmlns:wp14="http://schemas.microsoft.com/office/word/2010/wordprocessingDrawing" xmlns:wp="http://schemas.openxmlformats.org/drawingml/2006/wordprocessingDrawing" xmlns:wpc="http://schemas.microsoft.com/office/word/2010/wordprocessingCanvas" xmlns:wpg="http://schemas.microsoft.com/office/word/2010/wordprocessingGroup" xmlns:wpi="http://schemas.microsoft.com/office/word/2010/wordprocessingInk" xmlns:wps="http://schemas.microsoft.com/office/word/2010/wordprocessingShape" mc:Ignorable="w14 wp14">
   <w:p>
@@ -2353,7 +3827,7 @@
       <w:rPr>
         <w:sz w:val="16"/>
       </w:rPr>
-      <w:t xml:space="preserve">合成环境 · 研究定义 v1.0     |     </w:t>
+      <w:t xml:space="preserve">研究定义 v1.1     |     </w:t>
     </w:r>
     <w:fldSimple w:instr="PAGE"/>
   </w:p>
@@ -2368,7 +3842,7 @@
     </w:pPr>
     <w:r>
       <w:rPr>
-        <w:color w:val="79939A"/>
+        <w:color w:val="000000"/>
         <w:sz w:val="16"/>
       </w:rPr>
       <w:t>CORALBLEACH-AGENT   /   SCIENTIFIC PROBLEM DEFINITION</w:t>
@@ -2812,9 +4286,10 @@
       <w:rFonts w:asciiTheme="majorHAnsi" w:eastAsiaTheme="majorEastAsia" w:hAnsiTheme="majorHAnsi" w:cstheme="majorBidi" w:ascii="Microsoft YaHei" w:hAnsi="Microsoft YaHei" w:eastAsia="Microsoft YaHei"/>
       <w:b/>
       <w:bCs/>
-      <w:color w:val="146F6A"/>
+      <w:color w:val="000000"/>
       <w:sz w:val="32"/>
       <w:szCs w:val="28"/>
+      <w:u w:val="none"/>
     </w:rPr>
   </w:style>
   <w:style w:type="paragraph" w:styleId="Heading2">
@@ -2836,9 +4311,10 @@
       <w:rFonts w:asciiTheme="majorHAnsi" w:eastAsiaTheme="majorEastAsia" w:hAnsiTheme="majorHAnsi" w:cstheme="majorBidi" w:ascii="Microsoft YaHei" w:hAnsi="Microsoft YaHei" w:eastAsia="Microsoft YaHei"/>
       <w:b/>
       <w:bCs/>
-      <w:color w:val="146F6A"/>
+      <w:color w:val="000000"/>
       <w:sz w:val="24"/>
       <w:szCs w:val="26"/>
+      <w:u w:val="none"/>
     </w:rPr>
   </w:style>
   <w:style w:type="paragraph" w:styleId="Heading3">
@@ -2860,8 +4336,9 @@
       <w:rFonts w:asciiTheme="majorHAnsi" w:eastAsiaTheme="majorEastAsia" w:hAnsiTheme="majorHAnsi" w:cstheme="majorBidi" w:ascii="Microsoft YaHei" w:hAnsi="Microsoft YaHei" w:eastAsia="Microsoft YaHei"/>
       <w:b/>
       <w:bCs/>
-      <w:color w:val="146F6A"/>
+      <w:color w:val="000000"/>
       <w:sz w:val="22"/>
+      <w:u w:val="none"/>
     </w:rPr>
   </w:style>
   <w:style w:type="paragraph" w:styleId="Heading4">
@@ -3092,19 +4569,17 @@
     <w:qFormat/>
     <w:rsid w:val="00FC693F"/>
     <w:pPr>
-      <w:pBdr>
-        <w:bottom w:val="single" w:sz="8" w:space="4" w:color="4F81BD" w:themeColor="accent1"/>
-      </w:pBdr>
       <w:spacing w:after="300" w:line="240" w:lineRule="auto"/>
       <w:contextualSpacing/>
     </w:pPr>
     <w:rPr>
       <w:rFonts w:asciiTheme="majorHAnsi" w:eastAsiaTheme="majorEastAsia" w:hAnsiTheme="majorHAnsi" w:cstheme="majorBidi" w:ascii="Microsoft YaHei" w:hAnsi="Microsoft YaHei" w:eastAsia="Microsoft YaHei"/>
-      <w:color w:val="17365D" w:themeColor="text2" w:themeShade="BF"/>
+      <w:color w:val="000000"/>
       <w:spacing w:val="5"/>
       <w:kern w:val="28"/>
       <w:sz w:val="52"/>
       <w:szCs w:val="52"/>
+      <w:u w:val="none"/>
     </w:rPr>
   </w:style>
   <w:style w:type="character" w:customStyle="1" w:styleId="TitleChar">
@@ -3139,10 +4614,11 @@
       <w:rFonts w:asciiTheme="majorHAnsi" w:eastAsiaTheme="majorEastAsia" w:hAnsiTheme="majorHAnsi" w:cstheme="majorBidi" w:ascii="Microsoft YaHei" w:hAnsi="Microsoft YaHei" w:eastAsia="Microsoft YaHei"/>
       <w:i/>
       <w:iCs/>
-      <w:color w:val="4F81BD" w:themeColor="accent1"/>
+      <w:color w:val="000000"/>
       <w:spacing w:val="15"/>
       <w:sz w:val="24"/>
       <w:szCs w:val="24"/>
+      <w:u w:val="none"/>
     </w:rPr>
   </w:style>
   <w:style w:type="character" w:customStyle="1" w:styleId="SubtitleChar">

</xml_diff>